<commit_message>
docs: intento de mejora de maquetación en la documentación
</commit_message>
<xml_diff>
--- a/docs/BUNNIES AND TEA.docx
+++ b/docs/BUNNIES AND TEA.docx
@@ -5612,10 +5612,12 @@
               <w:t>El sistema debe permitir el registro de nuevos usuarios (email/</w:t>
             </w:r>
             <w:proofErr w:type="spellStart"/>
+            <w:proofErr w:type="gramStart"/>
             <w:r>
               <w:t>password</w:t>
             </w:r>
             <w:proofErr w:type="spellEnd"/>
+            <w:proofErr w:type="gramEnd"/>
             <w:r>
               <w:t>) y el inicio/cierre de sesión seguro mediante el manejo de variables de sesión ($_SESSION).</w:t>
             </w:r>
@@ -6096,12 +6098,25 @@
               <w:t xml:space="preserve"> criptográfico seguro (ej. </w:t>
             </w:r>
             <w:proofErr w:type="spellStart"/>
-            <w:r>
-              <w:t>password_hash</w:t>
+            <w:proofErr w:type="gramStart"/>
+            <w:r>
+              <w:t>password</w:t>
+            </w:r>
+            <w:proofErr w:type="gramEnd"/>
+            <w:r>
+              <w:t>_</w:t>
+            </w:r>
+            <w:proofErr w:type="gramStart"/>
+            <w:r>
+              <w:t>hash</w:t>
             </w:r>
             <w:proofErr w:type="spellEnd"/>
             <w:r>
-              <w:t>() de PHP) antes de almacenarse en la base de datos.</w:t>
+              <w:t>(</w:t>
+            </w:r>
+            <w:proofErr w:type="gramEnd"/>
+            <w:r>
+              <w:t>) de PHP) antes de almacenarse en la base de datos.</w:t>
             </w:r>
           </w:p>
         </w:tc>
@@ -7524,8 +7539,13 @@
               <w:spacing w:after="160"/>
               <w:cnfStyle w:val="000000000000" w:firstRow="0" w:lastRow="0" w:firstColumn="0" w:lastColumn="0" w:oddVBand="0" w:evenVBand="0" w:oddHBand="0" w:evenHBand="0" w:firstRowFirstColumn="0" w:firstRowLastColumn="0" w:lastRowFirstColumn="0" w:lastRowLastColumn="0"/>
             </w:pPr>
-            <w:r>
-              <w:t>VARCHAR(255)</w:t>
+            <w:proofErr w:type="gramStart"/>
+            <w:r>
+              <w:t>VARCHAR(</w:t>
+            </w:r>
+            <w:proofErr w:type="gramEnd"/>
+            <w:r>
+              <w:t>255)</w:t>
             </w:r>
           </w:p>
         </w:tc>
@@ -7596,8 +7616,13 @@
               <w:spacing w:after="160"/>
               <w:cnfStyle w:val="000000000000" w:firstRow="0" w:lastRow="0" w:firstColumn="0" w:lastColumn="0" w:oddVBand="0" w:evenVBand="0" w:oddHBand="0" w:evenHBand="0" w:firstRowFirstColumn="0" w:firstRowLastColumn="0" w:lastRowFirstColumn="0" w:lastRowLastColumn="0"/>
             </w:pPr>
-            <w:r>
-              <w:t>VARCHAR(255)</w:t>
+            <w:proofErr w:type="gramStart"/>
+            <w:r>
+              <w:t>VARCHAR(</w:t>
+            </w:r>
+            <w:proofErr w:type="gramEnd"/>
+            <w:r>
+              <w:t>255)</w:t>
             </w:r>
           </w:p>
         </w:tc>
@@ -7668,8 +7693,13 @@
               <w:spacing w:after="160"/>
               <w:cnfStyle w:val="000000000000" w:firstRow="0" w:lastRow="0" w:firstColumn="0" w:lastColumn="0" w:oddVBand="0" w:evenVBand="0" w:oddHBand="0" w:evenHBand="0" w:firstRowFirstColumn="0" w:firstRowLastColumn="0" w:lastRowFirstColumn="0" w:lastRowLastColumn="0"/>
             </w:pPr>
-            <w:r>
-              <w:t>VARCHAR(100)</w:t>
+            <w:proofErr w:type="gramStart"/>
+            <w:r>
+              <w:t>VARCHAR(</w:t>
+            </w:r>
+            <w:proofErr w:type="gramEnd"/>
+            <w:r>
+              <w:t>100)</w:t>
             </w:r>
           </w:p>
         </w:tc>
@@ -7729,8 +7759,13 @@
               <w:spacing w:after="160"/>
               <w:cnfStyle w:val="000000000000" w:firstRow="0" w:lastRow="0" w:firstColumn="0" w:lastColumn="0" w:oddVBand="0" w:evenVBand="0" w:oddHBand="0" w:evenHBand="0" w:firstRowFirstColumn="0" w:firstRowLastColumn="0" w:lastRowFirstColumn="0" w:lastRowLastColumn="0"/>
             </w:pPr>
-            <w:r>
-              <w:t>DECIMAL(20,2)</w:t>
+            <w:proofErr w:type="gramStart"/>
+            <w:r>
+              <w:t>DECIMAL(</w:t>
+            </w:r>
+            <w:proofErr w:type="gramEnd"/>
+            <w:r>
+              <w:t>20,2)</w:t>
             </w:r>
           </w:p>
         </w:tc>
@@ -7793,8 +7828,13 @@
               <w:spacing w:after="160"/>
               <w:cnfStyle w:val="000000000000" w:firstRow="0" w:lastRow="0" w:firstColumn="0" w:lastColumn="0" w:oddVBand="0" w:evenVBand="0" w:oddHBand="0" w:evenHBand="0" w:firstRowFirstColumn="0" w:firstRowLastColumn="0" w:lastRowFirstColumn="0" w:lastRowLastColumn="0"/>
             </w:pPr>
-            <w:r>
-              <w:t>DECIMAL(10,2)</w:t>
+            <w:proofErr w:type="gramStart"/>
+            <w:r>
+              <w:t>DECIMAL(</w:t>
+            </w:r>
+            <w:proofErr w:type="gramEnd"/>
+            <w:r>
+              <w:t>10,2)</w:t>
             </w:r>
           </w:p>
         </w:tc>
@@ -7921,8 +7961,13 @@
               <w:spacing w:after="160"/>
               <w:cnfStyle w:val="000000000000" w:firstRow="0" w:lastRow="0" w:firstColumn="0" w:lastColumn="0" w:oddVBand="0" w:evenVBand="0" w:oddHBand="0" w:evenHBand="0" w:firstRowFirstColumn="0" w:firstRowLastColumn="0" w:lastRowFirstColumn="0" w:lastRowLastColumn="0"/>
             </w:pPr>
-            <w:r>
-              <w:t>DECIMAL(20,2)</w:t>
+            <w:proofErr w:type="gramStart"/>
+            <w:r>
+              <w:t>DECIMAL(</w:t>
+            </w:r>
+            <w:proofErr w:type="gramEnd"/>
+            <w:r>
+              <w:t>20,2)</w:t>
             </w:r>
           </w:p>
         </w:tc>
@@ -7951,8 +7996,13 @@
               <w:spacing w:after="160"/>
               <w:cnfStyle w:val="000000000000" w:firstRow="0" w:lastRow="0" w:firstColumn="0" w:lastColumn="0" w:oddVBand="0" w:evenVBand="0" w:oddHBand="0" w:evenHBand="0" w:firstRowFirstColumn="0" w:firstRowLastColumn="0" w:lastRowFirstColumn="0" w:lastRowLastColumn="0"/>
             </w:pPr>
-            <w:r>
-              <w:t>Total histórico generado. Usado para hitos y prestigio.</w:t>
+            <w:proofErr w:type="gramStart"/>
+            <w:r>
+              <w:t>Total</w:t>
+            </w:r>
+            <w:proofErr w:type="gramEnd"/>
+            <w:r>
+              <w:t xml:space="preserve"> histórico generado. Usado para hitos y prestigio.</w:t>
             </w:r>
           </w:p>
         </w:tc>
@@ -8215,8 +8265,13 @@
               <w:spacing w:after="160"/>
               <w:cnfStyle w:val="000000000000" w:firstRow="0" w:lastRow="0" w:firstColumn="0" w:lastColumn="0" w:oddVBand="0" w:evenVBand="0" w:oddHBand="0" w:evenHBand="0" w:firstRowFirstColumn="0" w:firstRowLastColumn="0" w:lastRowFirstColumn="0" w:lastRowLastColumn="0"/>
             </w:pPr>
-            <w:r>
-              <w:t>VARCHAR(100)</w:t>
+            <w:proofErr w:type="gramStart"/>
+            <w:r>
+              <w:t>VARCHAR(</w:t>
+            </w:r>
+            <w:proofErr w:type="gramEnd"/>
+            <w:r>
+              <w:t>100)</w:t>
             </w:r>
           </w:p>
         </w:tc>
@@ -8277,8 +8332,13 @@
               <w:spacing w:after="160"/>
               <w:cnfStyle w:val="000000000000" w:firstRow="0" w:lastRow="0" w:firstColumn="0" w:lastColumn="0" w:oddVBand="0" w:evenVBand="0" w:oddHBand="0" w:evenHBand="0" w:firstRowFirstColumn="0" w:firstRowLastColumn="0" w:lastRowFirstColumn="0" w:lastRowLastColumn="0"/>
             </w:pPr>
-            <w:r>
-              <w:t>VARCHAR(50)</w:t>
+            <w:proofErr w:type="gramStart"/>
+            <w:r>
+              <w:t>VARCHAR(</w:t>
+            </w:r>
+            <w:proofErr w:type="gramEnd"/>
+            <w:r>
+              <w:t>50)</w:t>
             </w:r>
           </w:p>
         </w:tc>
@@ -8338,8 +8398,13 @@
               <w:spacing w:after="160"/>
               <w:cnfStyle w:val="000000000000" w:firstRow="0" w:lastRow="0" w:firstColumn="0" w:lastColumn="0" w:oddVBand="0" w:evenVBand="0" w:oddHBand="0" w:evenHBand="0" w:firstRowFirstColumn="0" w:firstRowLastColumn="0" w:lastRowFirstColumn="0" w:lastRowLastColumn="0"/>
             </w:pPr>
-            <w:r>
-              <w:t>DECIMAL(10,2)</w:t>
+            <w:proofErr w:type="gramStart"/>
+            <w:r>
+              <w:t>DECIMAL(</w:t>
+            </w:r>
+            <w:proofErr w:type="gramEnd"/>
+            <w:r>
+              <w:t>10,2)</w:t>
             </w:r>
           </w:p>
         </w:tc>
@@ -8402,8 +8467,13 @@
               <w:spacing w:after="160"/>
               <w:cnfStyle w:val="000000000000" w:firstRow="0" w:lastRow="0" w:firstColumn="0" w:lastColumn="0" w:oddVBand="0" w:evenVBand="0" w:oddHBand="0" w:evenHBand="0" w:firstRowFirstColumn="0" w:firstRowLastColumn="0" w:lastRowFirstColumn="0" w:lastRowLastColumn="0"/>
             </w:pPr>
-            <w:r>
-              <w:t>DECIMAL(15,2)</w:t>
+            <w:proofErr w:type="gramStart"/>
+            <w:r>
+              <w:t>DECIMAL(</w:t>
+            </w:r>
+            <w:proofErr w:type="gramEnd"/>
+            <w:r>
+              <w:t>15,2)</w:t>
             </w:r>
           </w:p>
         </w:tc>
@@ -8639,8 +8709,13 @@
               <w:spacing w:after="160"/>
               <w:cnfStyle w:val="000000000000" w:firstRow="0" w:lastRow="0" w:firstColumn="0" w:lastColumn="0" w:oddVBand="0" w:evenVBand="0" w:oddHBand="0" w:evenHBand="0" w:firstRowFirstColumn="0" w:firstRowLastColumn="0" w:lastRowFirstColumn="0" w:lastRowLastColumn="0"/>
             </w:pPr>
-            <w:r>
-              <w:t>VARCHAR(100)</w:t>
+            <w:proofErr w:type="gramStart"/>
+            <w:r>
+              <w:t>VARCHAR(</w:t>
+            </w:r>
+            <w:proofErr w:type="gramEnd"/>
+            <w:r>
+              <w:t>100)</w:t>
             </w:r>
           </w:p>
         </w:tc>
@@ -8703,8 +8778,13 @@
               <w:spacing w:after="160"/>
               <w:cnfStyle w:val="000000000000" w:firstRow="0" w:lastRow="0" w:firstColumn="0" w:lastColumn="0" w:oddVBand="0" w:evenVBand="0" w:oddHBand="0" w:evenHBand="0" w:firstRowFirstColumn="0" w:firstRowLastColumn="0" w:lastRowFirstColumn="0" w:lastRowLastColumn="0"/>
             </w:pPr>
-            <w:r>
-              <w:t>DECIMAL(10,2)</w:t>
+            <w:proofErr w:type="gramStart"/>
+            <w:r>
+              <w:t>DECIMAL(</w:t>
+            </w:r>
+            <w:proofErr w:type="gramEnd"/>
+            <w:r>
+              <w:t>10,2)</w:t>
             </w:r>
           </w:p>
         </w:tc>
@@ -8768,8 +8848,13 @@
               <w:spacing w:after="160"/>
               <w:cnfStyle w:val="000000000000" w:firstRow="0" w:lastRow="0" w:firstColumn="0" w:lastColumn="0" w:oddVBand="0" w:evenVBand="0" w:oddHBand="0" w:evenHBand="0" w:firstRowFirstColumn="0" w:firstRowLastColumn="0" w:lastRowFirstColumn="0" w:lastRowLastColumn="0"/>
             </w:pPr>
-            <w:r>
-              <w:t>DECIMAL(10,2)</w:t>
+            <w:proofErr w:type="gramStart"/>
+            <w:r>
+              <w:t>DECIMAL(</w:t>
+            </w:r>
+            <w:proofErr w:type="gramEnd"/>
+            <w:r>
+              <w:t>10,2)</w:t>
             </w:r>
           </w:p>
         </w:tc>
@@ -8832,8 +8917,13 @@
               <w:spacing w:after="160"/>
               <w:cnfStyle w:val="000000000000" w:firstRow="0" w:lastRow="0" w:firstColumn="0" w:lastColumn="0" w:oddVBand="0" w:evenVBand="0" w:oddHBand="0" w:evenHBand="0" w:firstRowFirstColumn="0" w:firstRowLastColumn="0" w:lastRowFirstColumn="0" w:lastRowLastColumn="0"/>
             </w:pPr>
-            <w:r>
-              <w:t>DECIMAL(15,2)</w:t>
+            <w:proofErr w:type="gramStart"/>
+            <w:r>
+              <w:t>DECIMAL(</w:t>
+            </w:r>
+            <w:proofErr w:type="gramEnd"/>
+            <w:r>
+              <w:t>15,2)</w:t>
             </w:r>
           </w:p>
         </w:tc>
@@ -9125,8 +9215,13 @@
               <w:spacing w:after="160"/>
               <w:cnfStyle w:val="000000000000" w:firstRow="0" w:lastRow="0" w:firstColumn="0" w:lastColumn="0" w:oddVBand="0" w:evenVBand="0" w:oddHBand="0" w:evenHBand="0" w:firstRowFirstColumn="0" w:firstRowLastColumn="0" w:lastRowFirstColumn="0" w:lastRowLastColumn="0"/>
             </w:pPr>
-            <w:r>
-              <w:t>VARCHAR(100)</w:t>
+            <w:proofErr w:type="gramStart"/>
+            <w:r>
+              <w:t>VARCHAR(</w:t>
+            </w:r>
+            <w:proofErr w:type="gramEnd"/>
+            <w:r>
+              <w:t>100)</w:t>
             </w:r>
           </w:p>
         </w:tc>
@@ -9189,8 +9284,13 @@
               <w:spacing w:after="160"/>
               <w:cnfStyle w:val="000000000000" w:firstRow="0" w:lastRow="0" w:firstColumn="0" w:lastColumn="0" w:oddVBand="0" w:evenVBand="0" w:oddHBand="0" w:evenHBand="0" w:firstRowFirstColumn="0" w:firstRowLastColumn="0" w:lastRowFirstColumn="0" w:lastRowLastColumn="0"/>
             </w:pPr>
-            <w:r>
-              <w:t>VARCHAR(255)</w:t>
+            <w:proofErr w:type="gramStart"/>
+            <w:r>
+              <w:t>VARCHAR(</w:t>
+            </w:r>
+            <w:proofErr w:type="gramEnd"/>
+            <w:r>
+              <w:t>255)</w:t>
             </w:r>
           </w:p>
         </w:tc>
@@ -9253,8 +9353,13 @@
               <w:spacing w:after="160"/>
               <w:cnfStyle w:val="000000000000" w:firstRow="0" w:lastRow="0" w:firstColumn="0" w:lastColumn="0" w:oddVBand="0" w:evenVBand="0" w:oddHBand="0" w:evenHBand="0" w:firstRowFirstColumn="0" w:firstRowLastColumn="0" w:lastRowFirstColumn="0" w:lastRowLastColumn="0"/>
             </w:pPr>
-            <w:r>
-              <w:t>VARCHAR(50)</w:t>
+            <w:proofErr w:type="gramStart"/>
+            <w:r>
+              <w:t>VARCHAR(</w:t>
+            </w:r>
+            <w:proofErr w:type="gramEnd"/>
+            <w:r>
+              <w:t>50)</w:t>
             </w:r>
           </w:p>
         </w:tc>
@@ -9333,8 +9438,13 @@
               <w:spacing w:after="160"/>
               <w:cnfStyle w:val="000000000000" w:firstRow="0" w:lastRow="0" w:firstColumn="0" w:lastColumn="0" w:oddVBand="0" w:evenVBand="0" w:oddHBand="0" w:evenHBand="0" w:firstRowFirstColumn="0" w:firstRowLastColumn="0" w:lastRowFirstColumn="0" w:lastRowLastColumn="0"/>
             </w:pPr>
-            <w:r>
-              <w:t>DECIMAL(20,2)</w:t>
+            <w:proofErr w:type="gramStart"/>
+            <w:r>
+              <w:t>DECIMAL(</w:t>
+            </w:r>
+            <w:proofErr w:type="gramEnd"/>
+            <w:r>
+              <w:t>20,2)</w:t>
             </w:r>
           </w:p>
         </w:tc>
@@ -9397,8 +9507,13 @@
               <w:spacing w:after="160"/>
               <w:cnfStyle w:val="000000000000" w:firstRow="0" w:lastRow="0" w:firstColumn="0" w:lastColumn="0" w:oddVBand="0" w:evenVBand="0" w:oddHBand="0" w:evenHBand="0" w:firstRowFirstColumn="0" w:firstRowLastColumn="0" w:lastRowFirstColumn="0" w:lastRowLastColumn="0"/>
             </w:pPr>
-            <w:r>
-              <w:t>DECIMAL(5,2)</w:t>
+            <w:proofErr w:type="gramStart"/>
+            <w:r>
+              <w:t>DECIMAL(</w:t>
+            </w:r>
+            <w:proofErr w:type="gramEnd"/>
+            <w:r>
+              <w:t>5,2)</w:t>
             </w:r>
           </w:p>
         </w:tc>
@@ -9661,10 +9776,12 @@
               <w:t>FK (</w:t>
             </w:r>
             <w:proofErr w:type="spellStart"/>
+            <w:proofErr w:type="gramStart"/>
             <w:r>
               <w:t>usuario.usuarioId</w:t>
             </w:r>
             <w:proofErr w:type="spellEnd"/>
+            <w:proofErr w:type="gramEnd"/>
             <w:r>
               <w:t>)</w:t>
             </w:r>
@@ -9733,10 +9850,12 @@
               <w:t>FK (</w:t>
             </w:r>
             <w:proofErr w:type="spellStart"/>
+            <w:proofErr w:type="gramStart"/>
             <w:r>
               <w:t>conejo.conejoId</w:t>
             </w:r>
             <w:proofErr w:type="spellEnd"/>
+            <w:proofErr w:type="gramEnd"/>
             <w:r>
               <w:t>)</w:t>
             </w:r>
@@ -10052,10 +10171,12 @@
               <w:t>FK (</w:t>
             </w:r>
             <w:proofErr w:type="spellStart"/>
+            <w:proofErr w:type="gramStart"/>
             <w:r>
               <w:t>usuario.usuarioId</w:t>
             </w:r>
             <w:proofErr w:type="spellEnd"/>
+            <w:proofErr w:type="gramEnd"/>
             <w:r>
               <w:t>)</w:t>
             </w:r>
@@ -10124,10 +10245,12 @@
               <w:t>FK (</w:t>
             </w:r>
             <w:proofErr w:type="spellStart"/>
+            <w:proofErr w:type="gramStart"/>
             <w:r>
               <w:t>utensilio.utensilioId</w:t>
             </w:r>
             <w:proofErr w:type="spellEnd"/>
+            <w:proofErr w:type="gramEnd"/>
             <w:r>
               <w:t>)</w:t>
             </w:r>
@@ -10422,10 +10545,12 @@
               <w:t>FK (</w:t>
             </w:r>
             <w:proofErr w:type="spellStart"/>
+            <w:proofErr w:type="gramStart"/>
             <w:r>
               <w:t>usuario.usuarioId</w:t>
             </w:r>
             <w:proofErr w:type="spellEnd"/>
+            <w:proofErr w:type="gramEnd"/>
             <w:r>
               <w:t>)</w:t>
             </w:r>
@@ -10494,10 +10619,12 @@
               <w:t>FK (</w:t>
             </w:r>
             <w:proofErr w:type="spellStart"/>
+            <w:proofErr w:type="gramStart"/>
             <w:r>
               <w:t>logro.logroId</w:t>
             </w:r>
             <w:proofErr w:type="spellEnd"/>
+            <w:proofErr w:type="gramEnd"/>
             <w:r>
               <w:t>)</w:t>
             </w:r>
@@ -11835,7 +11962,15 @@
         <w:t xml:space="preserve"> </w:t>
       </w:r>
       <w:r>
-        <w:t>A continuación detallo la lista de tareas secuenciadas:</w:t>
+        <w:t xml:space="preserve">A </w:t>
+      </w:r>
+      <w:proofErr w:type="gramStart"/>
+      <w:r>
+        <w:t>continuación</w:t>
+      </w:r>
+      <w:proofErr w:type="gramEnd"/>
+      <w:r>
+        <w:t xml:space="preserve"> detallo la lista de tareas secuenciadas:</w:t>
       </w:r>
     </w:p>
     <w:p>
@@ -12585,20 +12720,49 @@
         <w:t> Las contraseñas de los jugadores nunca se guardan en texto plano en la base de datos. He implementado la función nativa </w:t>
       </w:r>
       <w:proofErr w:type="spellStart"/>
-      <w:r>
-        <w:t>password_hash</w:t>
+      <w:proofErr w:type="gramStart"/>
+      <w:r>
+        <w:t>password</w:t>
+      </w:r>
+      <w:proofErr w:type="gramEnd"/>
+      <w:r>
+        <w:t>_</w:t>
+      </w:r>
+      <w:proofErr w:type="gramStart"/>
+      <w:r>
+        <w:t>hash</w:t>
       </w:r>
       <w:proofErr w:type="spellEnd"/>
       <w:r>
-        <w:t>() de PHP, que aplica un algoritmo de cifrado robusto. Esto asegura que, incluso en el hipotético caso de que la base de datos fuera vulnerada, las contraseñas de los usuarios estarían protegidas y serían ilegibles. Para el proceso de autenticación, la aplicación utiliza la función correspondiente </w:t>
+        <w:t>(</w:t>
+      </w:r>
+      <w:proofErr w:type="gramEnd"/>
+      <w:r>
+        <w:t xml:space="preserve">) de PHP, que aplica un algoritmo de cifrado robusto. Esto asegura que, incluso en el hipotético caso de que la base de datos fuera vulnerada, las contraseñas de los usuarios estarían protegidas y serían ilegibles. Para el proceso de autenticación, la aplicación utiliza la función </w:t>
+      </w:r>
+      <w:proofErr w:type="gramStart"/>
+      <w:r>
+        <w:t>correspondiente </w:t>
       </w:r>
       <w:proofErr w:type="spellStart"/>
       <w:r>
-        <w:t>password_verify</w:t>
+        <w:t>password</w:t>
+      </w:r>
+      <w:proofErr w:type="gramEnd"/>
+      <w:r>
+        <w:t>_</w:t>
+      </w:r>
+      <w:proofErr w:type="gramStart"/>
+      <w:r>
+        <w:t>verify</w:t>
       </w:r>
       <w:proofErr w:type="spellEnd"/>
       <w:r>
-        <w:t>().</w:t>
+        <w:t>(</w:t>
+      </w:r>
+      <w:proofErr w:type="gramEnd"/>
+      <w:r>
+        <w:t>).</w:t>
       </w:r>
     </w:p>
     <w:p>
@@ -12811,7 +12975,15 @@
           <w:b/>
           <w:bCs/>
         </w:rPr>
-        <w:t xml:space="preserve">/ (Raíz del proyecto): </w:t>
+        <w:t>/ (Raíz del proyecto)</w:t>
+      </w:r>
+      <w:proofErr w:type="gramStart"/>
+      <w:r>
+        <w:rPr>
+          <w:b/>
+          <w:bCs/>
+        </w:rPr>
+        <w:t xml:space="preserve">: </w:t>
       </w:r>
       <w:r>
         <w:t>.</w:t>
@@ -12821,22 +12993,27 @@
         <w:t>gitignore</w:t>
       </w:r>
       <w:proofErr w:type="spellEnd"/>
+      <w:proofErr w:type="gramEnd"/>
       <w:r>
         <w:t xml:space="preserve">, </w:t>
       </w:r>
       <w:proofErr w:type="spellStart"/>
+      <w:proofErr w:type="gramStart"/>
       <w:r>
         <w:t>composer.json</w:t>
       </w:r>
       <w:proofErr w:type="spellEnd"/>
+      <w:proofErr w:type="gramEnd"/>
       <w:r>
         <w:t xml:space="preserve">, </w:t>
       </w:r>
       <w:proofErr w:type="spellStart"/>
+      <w:proofErr w:type="gramStart"/>
       <w:r>
         <w:t>composer.lock</w:t>
       </w:r>
       <w:proofErr w:type="spellEnd"/>
+      <w:proofErr w:type="gramEnd"/>
       <w:r>
         <w:t xml:space="preserve">, </w:t>
       </w:r>
@@ -13526,7 +13703,15 @@
     </w:p>
     <w:p>
       <w:r>
-        <w:t xml:space="preserve">Para garantizar una experiencia de usuario fluida y evitar la recarga constante del navegador, el cliente web se diseñó para operar de forma asíncrona, acercándose al comportamiento de una Single Page </w:t>
+        <w:t xml:space="preserve">Para garantizar una experiencia de usuario fluida y evitar la recarga constante del navegador, el cliente web se diseñó para operar de forma asíncrona, acercándose al comportamiento de una </w:t>
+      </w:r>
+      <w:proofErr w:type="gramStart"/>
+      <w:r>
+        <w:t>Single</w:t>
+      </w:r>
+      <w:proofErr w:type="gramEnd"/>
+      <w:r>
+        <w:t xml:space="preserve"> Page </w:t>
       </w:r>
       <w:proofErr w:type="spellStart"/>
       <w:r>
@@ -13660,7 +13845,15 @@
     </w:p>
     <w:p>
       <w:r>
-        <w:t xml:space="preserve">Si el cliente recibe datos del servidor pero existen peticiones en vuelo, asume que la respuesta del servidor contiene información "obsoleta" a nivel visual, ya que el usuario ha realizado acciones más recientes que el servidor aún está procesando. En estos casos, el </w:t>
+        <w:t xml:space="preserve">Si el cliente recibe datos del </w:t>
+      </w:r>
+      <w:proofErr w:type="gramStart"/>
+      <w:r>
+        <w:t>servidor</w:t>
+      </w:r>
+      <w:proofErr w:type="gramEnd"/>
+      <w:r>
+        <w:t xml:space="preserve"> pero existen peticiones en vuelo, asume que la respuesta del servidor contiene información "obsoleta" a nivel visual, ya que el usuario ha realizado acciones más recientes que el servidor aún está procesando. En estos casos, el </w:t>
       </w:r>
       <w:proofErr w:type="spellStart"/>
       <w:r>
@@ -13819,7 +14012,15 @@
       </w:r>
       <w:proofErr w:type="spellEnd"/>
       <w:r>
-        <w:t xml:space="preserve"> supera el límite de 50. El test verifica que la producción total calculada por el servidor se reduce automáticamente a la mitad, tal y como dictan las reglas de negocio.</w:t>
+        <w:t xml:space="preserve"> supera el límite de 50. </w:t>
+      </w:r>
+      <w:proofErr w:type="gramStart"/>
+      <w:r>
+        <w:t>El test</w:t>
+      </w:r>
+      <w:proofErr w:type="gramEnd"/>
+      <w:r>
+        <w:t xml:space="preserve"> verifica que la producción total calculada por el servidor se reduce automáticamente a la mitad, tal y como dictan las reglas de negocio.</w:t>
       </w:r>
     </w:p>
     <w:p>
@@ -14040,7 +14241,15 @@
     <w:p>
       <w:r>
         <w:lastRenderedPageBreak/>
-        <w:t>A continuación se presenta la matriz de resultados:</w:t>
+        <w:t xml:space="preserve">A </w:t>
+      </w:r>
+      <w:proofErr w:type="gramStart"/>
+      <w:r>
+        <w:t>continuación</w:t>
+      </w:r>
+      <w:proofErr w:type="gramEnd"/>
+      <w:r>
+        <w:t xml:space="preserve"> se presenta la matriz de resultados:</w:t>
       </w:r>
     </w:p>
     <w:tbl>
@@ -14504,10 +14713,12 @@
         <w:t xml:space="preserve">, se detectó un fallo visual. Si un jugador hacía clics manuales al mismo tiempo que el bucle de "producción pasiva" recibía datos de fondo, el contador de monedas en pantalla saltaba hacia atrás y hacia adelante. Esto ocurría porque la interfaz aceptaba ciegamente la respuesta del servidor que llegaba con latencia, sobrescribiendo y borrando los clics </w:t>
       </w:r>
       <w:proofErr w:type="spellStart"/>
+      <w:proofErr w:type="gramStart"/>
       <w:r>
         <w:t>locales.Se</w:t>
       </w:r>
       <w:proofErr w:type="spellEnd"/>
+      <w:proofErr w:type="gramEnd"/>
       <w:r>
         <w:t xml:space="preserve"> reestructuró la arquitectura de renderizado del cliente. En lugar de que el servidor dicte el número absoluto en cada actualización, se implementó un sistema de Predicción del Cliente. Mediante el uso de variables de control de red (</w:t>
       </w:r>
@@ -14570,7 +14781,23 @@
           <w:b/>
           <w:bCs/>
         </w:rPr>
-        <w:t xml:space="preserve">Transición a comportamiento SPA (Single Page </w:t>
+        <w:t>Transición a comportamiento SPA (</w:t>
+      </w:r>
+      <w:proofErr w:type="gramStart"/>
+      <w:r>
+        <w:rPr>
+          <w:b/>
+          <w:bCs/>
+        </w:rPr>
+        <w:t>Single</w:t>
+      </w:r>
+      <w:proofErr w:type="gramEnd"/>
+      <w:r>
+        <w:rPr>
+          <w:b/>
+          <w:bCs/>
+        </w:rPr>
+        <w:t xml:space="preserve"> Page </w:t>
       </w:r>
       <w:proofErr w:type="spellStart"/>
       <w:r>
@@ -14740,12 +14967,21 @@
           <w:numId w:val="30"/>
         </w:numPr>
       </w:pPr>
+      <w:proofErr w:type="gramStart"/>
       <w:r>
         <w:rPr>
           <w:b/>
           <w:bCs/>
         </w:rPr>
-        <w:t>app:</w:t>
+        <w:t>app</w:t>
+      </w:r>
+      <w:proofErr w:type="gramEnd"/>
+      <w:r>
+        <w:rPr>
+          <w:b/>
+          <w:bCs/>
+        </w:rPr>
+        <w:t>:</w:t>
       </w:r>
       <w:r>
         <w:t xml:space="preserve"> Un contenedor con el servidor web (Apache) y PHP 8, que expone el juego en el puerto 8080.</w:t>
@@ -15345,7 +15581,15 @@
       </w:r>
       <w:proofErr w:type="spellEnd"/>
       <w:r>
-        <w:t>): Actualmente el juego es robusto para un volumen moderado de usuarios. Sin embargo, para soportar a miles de jugadores concurrentes sin saturar la base de datos relacional, se llevaría la "Predicción del Cliente" al siguiente nivel. En lugar de informar al servidor cada pocos segundos, el motor matemático se ejecutaría casi al 100% en el navegador del jugador. El cliente encolaría todas las interacciones, clics y ganancias pasivas localmente, y enviaría un único "paquete de sincronización cifrado" al servidor cada 30 segundos (</w:t>
+        <w:t xml:space="preserve">): Actualmente el juego es robusto para un volumen moderado de usuarios. Sin embargo, para soportar a miles de jugadores concurrentes sin saturar la base de datos relacional, se llevaría la "Predicción del Cliente" al siguiente nivel. En lugar de informar al servidor </w:t>
+      </w:r>
+      <w:proofErr w:type="gramStart"/>
+      <w:r>
+        <w:t>cada pocos segundos</w:t>
+      </w:r>
+      <w:proofErr w:type="gramEnd"/>
+      <w:r>
+        <w:t>, el motor matemático se ejecutaría casi al 100% en el navegador del jugador. El cliente encolaría todas las interacciones, clics y ganancias pasivas localmente, y enviaría un único "paquete de sincronización cifrado" al servidor cada 30 segundos (</w:t>
       </w:r>
       <w:proofErr w:type="spellStart"/>
       <w:r>
@@ -15397,7 +15641,15 @@
       </w:r>
       <w:proofErr w:type="spellEnd"/>
       <w:r>
-        <w:t xml:space="preserve"> o sacrificios (ej. un objeto que multiplica enormemente tus ingresos pero ensucia el local el triple de rápido). También se planea incluir </w:t>
+        <w:t xml:space="preserve"> o sacrificios (ej. un objeto que multiplica enormemente tus </w:t>
+      </w:r>
+      <w:proofErr w:type="gramStart"/>
+      <w:r>
+        <w:t>ingresos</w:t>
+      </w:r>
+      <w:proofErr w:type="gramEnd"/>
+      <w:r>
+        <w:t xml:space="preserve"> pero ensucia el local el triple de rápido). También se planea incluir </w:t>
       </w:r>
       <w:r>
         <w:lastRenderedPageBreak/>
@@ -15472,8 +15724,13 @@
         <w:t>Documentación Oficial de PHP (The PHP Group): Manual de PHP, Referencia de Objetos de Datos de PHP (PDO), manejo seguro de contraseñas (</w:t>
       </w:r>
       <w:proofErr w:type="spellStart"/>
-      <w:r>
-        <w:t>password_hash</w:t>
+      <w:proofErr w:type="gramStart"/>
+      <w:r>
+        <w:t>password</w:t>
+      </w:r>
+      <w:proofErr w:type="gramEnd"/>
+      <w:r>
+        <w:t>_hash</w:t>
       </w:r>
       <w:proofErr w:type="spellEnd"/>
       <w:r>

</xml_diff>